<commit_message>
feat(docs): reference.docx branding FOXAI cho pandoc + sinh lai setup guide
- docs/templates/foxai-reference.docx: heading/title mau #0C5488 va xam #A9AAA9 (trich
  truc tiep tu logo chinh thuc fox.ai.vn, khong tu che mau); header moi trang nhung logo
  that + 'Cong ty CP Cong nghe FOXAI - fox.ai.vn - Tai lieu noi bo'; footer ten tai lieu
  + so trang (PAGE field)
- .claude/SETUP-GUIDE-FABLE-HARNESS.docx sinh lai voi reference moi — kiem chung 5/5:
  header FOXAI, logo nhung, PAGE field, mau brand trong styles, noi dung v1.1 nguyen ven
- SETUP-GUIDE-FABLE-HARNESS.md: ghi lenh sinh chuan kem --reference-doc de moi tai lieu
  DOCX sau nay cua repo dung chung branding

Co-Authored-By: Claude Fable 5 <noreply@anthropic.com>
</commit_message>
<xml_diff>
--- a/.claude/SETUP-GUIDE-FABLE-HARNESS.docx
+++ b/.claude/SETUP-GUIDE-FABLE-HARNESS.docx
@@ -36,7 +36,7 @@
         </w:p>
       </w:sdtContent>
     </w:sdt>
-    <w:bookmarkStart w:id="41" w:name="Xc5312895e46d2d8f026af52524d2ce5b620dc85"/>
+    <w:bookmarkStart w:id="51" w:name="Xc5312895e46d2d8f026af52524d2ce5b620dc85"/>
     <w:p>
       <w:pPr>
         <w:pStyle w:val="Heading1"/>
@@ -231,7 +231,7 @@
         <w:t xml:space="preserve">kèm kết quả đo thật trên Sonnet và Opus.</w:t>
       </w:r>
     </w:p>
-    <w:bookmarkStart w:id="9" w:name="giả-định-của-tài-liệu"/>
+    <w:bookmarkStart w:id="19" w:name="giả-định-của-tài-liệu"/>
     <w:p>
       <w:pPr>
         <w:pStyle w:val="Heading2"/>
@@ -381,8 +381,8 @@
         </w:pict>
       </w:r>
     </w:p>
-    <w:bookmarkEnd w:id="9"/>
-    <w:bookmarkStart w:id="14" w:name="X7b3089b2656efed33c9734a0edd505f66c8dfc8"/>
+    <w:bookmarkEnd w:id="19"/>
+    <w:bookmarkStart w:id="24" w:name="X7b3089b2656efed33c9734a0edd505f66c8dfc8"/>
     <w:p>
       <w:pPr>
         <w:pStyle w:val="Heading2"/>
@@ -391,7 +391,7 @@
         <w:t xml:space="preserve">1. Tổng quan</w:t>
       </w:r>
     </w:p>
-    <w:bookmarkStart w:id="10" w:name="X0c8c292a328d2f3a03a1c2b59dcabe73ce7e0f9"/>
+    <w:bookmarkStart w:id="20" w:name="X0c8c292a328d2f3a03a1c2b59dcabe73ce7e0f9"/>
     <w:p>
       <w:pPr>
         <w:pStyle w:val="Heading3"/>
@@ -416,8 +416,8 @@
         <w:t xml:space="preserve">Nguồn nội dung: chưng cất từ hiến pháp hành vi Claude công bố công khai (anthropic.com/constitution) + nguyên tắc vận hành agentic (verify-before-done, scope discipline, calibrated uncertainty) — không phải bản sao system prompt nội bộ của Anthropic.</w:t>
       </w:r>
     </w:p>
-    <w:bookmarkEnd w:id="10"/>
-    <w:bookmarkStart w:id="11" w:name="X0289f9b0c01d151e2218f37d77190cb7b187267"/>
+    <w:bookmarkEnd w:id="20"/>
+    <w:bookmarkStart w:id="21" w:name="X0289f9b0c01d151e2218f37d77190cb7b187267"/>
     <w:p>
       <w:pPr>
         <w:pStyle w:val="Heading3"/>
@@ -584,8 +584,8 @@
         </w:tc>
       </w:tr>
     </w:tbl>
-    <w:bookmarkEnd w:id="11"/>
-    <w:bookmarkStart w:id="12" w:name="Xbd480bad3efcb3af918c35242b30094b69880ce"/>
+    <w:bookmarkEnd w:id="21"/>
+    <w:bookmarkStart w:id="22" w:name="Xbd480bad3efcb3af918c35242b30094b69880ce"/>
     <w:p>
       <w:pPr>
         <w:pStyle w:val="Heading3"/>
@@ -803,8 +803,8 @@
         </w:tc>
       </w:tr>
     </w:tbl>
-    <w:bookmarkEnd w:id="12"/>
-    <w:bookmarkStart w:id="13" w:name="X4ecea08bb46534dcc710c9a786d54afe03ab3c3"/>
+    <w:bookmarkEnd w:id="22"/>
+    <w:bookmarkStart w:id="23" w:name="X4ecea08bb46534dcc710c9a786d54afe03ab3c3"/>
     <w:p>
       <w:pPr>
         <w:pStyle w:val="Heading3"/>
@@ -1379,9 +1379,9 @@
         </w:tc>
       </w:tr>
     </w:tbl>
-    <w:bookmarkEnd w:id="13"/>
-    <w:bookmarkEnd w:id="14"/>
-    <w:bookmarkStart w:id="15" w:name="Xecca68184174e3ad4bb5c133be55340b24f084c"/>
+    <w:bookmarkEnd w:id="23"/>
+    <w:bookmarkEnd w:id="24"/>
+    <w:bookmarkStart w:id="25" w:name="Xecca68184174e3ad4bb5c133be55340b24f084c"/>
     <w:p>
       <w:pPr>
         <w:pStyle w:val="Heading2"/>
@@ -1631,8 +1631,8 @@
         </w:tc>
       </w:tr>
     </w:tbl>
-    <w:bookmarkEnd w:id="15"/>
-    <w:bookmarkStart w:id="22" w:name="X2e2fb3eacba7f3af6213340894175694bf5459a"/>
+    <w:bookmarkEnd w:id="25"/>
+    <w:bookmarkStart w:id="32" w:name="X2e2fb3eacba7f3af6213340894175694bf5459a"/>
     <w:p>
       <w:pPr>
         <w:pStyle w:val="Heading2"/>
@@ -1641,7 +1641,7 @@
         <w:t xml:space="preserve">3. Cài đặt</w:t>
       </w:r>
     </w:p>
-    <w:bookmarkStart w:id="16" w:name="X6e456b48b2ce908f7d53a1fb483d6e854f7acdc"/>
+    <w:bookmarkStart w:id="26" w:name="X6e456b48b2ce908f7d53a1fb483d6e854f7acdc"/>
     <w:p>
       <w:pPr>
         <w:pStyle w:val="Heading3"/>
@@ -1749,8 +1749,8 @@
         <w:t xml:space="preserve">hooks; tự kiểm tra sau cài.</w:t>
       </w:r>
     </w:p>
-    <w:bookmarkEnd w:id="16"/>
-    <w:bookmarkStart w:id="17" w:name="X7128a0ca79e76c0781e4bf4831952d664f54059"/>
+    <w:bookmarkEnd w:id="26"/>
+    <w:bookmarkStart w:id="27" w:name="X7128a0ca79e76c0781e4bf4831952d664f54059"/>
     <w:p>
       <w:pPr>
         <w:pStyle w:val="Heading3"/>
@@ -2229,8 +2229,8 @@
         <w:t xml:space="preserve">.</w:t>
       </w:r>
     </w:p>
-    <w:bookmarkEnd w:id="17"/>
-    <w:bookmarkStart w:id="18" w:name="X11755ee6c79648df1396706482f2d279439bf65"/>
+    <w:bookmarkEnd w:id="27"/>
+    <w:bookmarkStart w:id="28" w:name="X11755ee6c79648df1396706482f2d279439bf65"/>
     <w:p>
       <w:pPr>
         <w:pStyle w:val="Heading3"/>
@@ -2460,8 +2460,8 @@
         <w:t xml:space="preserve">trong CLAUDE.md cho các file này, sẽ nạp trùng 2 lần. Khuyến nghị FOXAI: cài theo project + commit vào git để cả team chung chuẩn có version control; bản global cho máy cá nhân.</w:t>
       </w:r>
     </w:p>
-    <w:bookmarkEnd w:id="18"/>
-    <w:bookmarkStart w:id="19" w:name="X33397398fd254c3371c47dd2ef525e5d64c469a"/>
+    <w:bookmarkEnd w:id="28"/>
+    <w:bookmarkStart w:id="29" w:name="X33397398fd254c3371c47dd2ef525e5d64c469a"/>
     <w:p>
       <w:pPr>
         <w:pStyle w:val="Heading3"/>
@@ -2540,8 +2540,8 @@
         <w:t xml:space="preserve">) đã có sẵn section "Chuẩn hành vi Fable (ƯU TIÊN CAO NHẤT)".</w:t>
       </w:r>
     </w:p>
-    <w:bookmarkEnd w:id="19"/>
-    <w:bookmarkStart w:id="20" w:name="X53c612b2a64f5cc34796975c43f96801ee75a1f"/>
+    <w:bookmarkEnd w:id="29"/>
+    <w:bookmarkStart w:id="30" w:name="X53c612b2a64f5cc34796975c43f96801ee75a1f"/>
     <w:p>
       <w:pPr>
         <w:pStyle w:val="Heading3"/>
@@ -2669,8 +2669,8 @@
         <w:t xml:space="preserve">(mục 10).</w:t>
       </w:r>
     </w:p>
-    <w:bookmarkEnd w:id="20"/>
-    <w:bookmarkStart w:id="21" w:name="X5b356900bf28251339ae44b570c3111bcd35a25"/>
+    <w:bookmarkEnd w:id="30"/>
+    <w:bookmarkStart w:id="31" w:name="X5b356900bf28251339ae44b570c3111bcd35a25"/>
     <w:p>
       <w:pPr>
         <w:pStyle w:val="Heading3"/>
@@ -2847,9 +2847,9 @@
         <w:t xml:space="preserve">).</w:t>
       </w:r>
     </w:p>
-    <w:bookmarkEnd w:id="21"/>
-    <w:bookmarkEnd w:id="22"/>
-    <w:bookmarkStart w:id="23" w:name="X99a7e13e101a39728c18ed29ecf88a95b79966b"/>
+    <w:bookmarkEnd w:id="31"/>
+    <w:bookmarkEnd w:id="32"/>
+    <w:bookmarkStart w:id="33" w:name="X99a7e13e101a39728c18ed29ecf88a95b79966b"/>
     <w:p>
       <w:pPr>
         <w:pStyle w:val="Heading2"/>
@@ -3491,8 +3491,8 @@
         <w:t xml:space="preserve">"Giả định:" · "Chưa kiểm chứng:" · "Phát hiện thêm:" · "Đã viết / Đã chạy / Đã kiểm chứng" · "(ước tính)".</w:t>
       </w:r>
     </w:p>
-    <w:bookmarkEnd w:id="23"/>
-    <w:bookmarkStart w:id="28" w:name="X9b71d3bb75afebea468ea7fe9a96f05c68863cc"/>
+    <w:bookmarkEnd w:id="33"/>
+    <w:bookmarkStart w:id="38" w:name="X9b71d3bb75afebea468ea7fe9a96f05c68863cc"/>
     <w:p>
       <w:pPr>
         <w:pStyle w:val="Heading2"/>
@@ -3560,7 +3560,7 @@
         <w:t xml:space="preserve">khi thiếu jq (Windows không cần cài jq).</w:t>
       </w:r>
     </w:p>
-    <w:bookmarkStart w:id="24" w:name="X4d163a8680d76e545f1f04929245144ccc91a07"/>
+    <w:bookmarkStart w:id="34" w:name="X4d163a8680d76e545f1f04929245144ccc91a07"/>
     <w:p>
       <w:pPr>
         <w:pStyle w:val="Heading3"/>
@@ -3607,8 +3607,8 @@
         <w:t xml:space="preserve">và compaction.</w:t>
       </w:r>
     </w:p>
-    <w:bookmarkEnd w:id="24"/>
-    <w:bookmarkStart w:id="25" w:name="X5c4dfdd102d655f2410259563d370a3b7bec45d"/>
+    <w:bookmarkEnd w:id="34"/>
+    <w:bookmarkStart w:id="35" w:name="X5c4dfdd102d655f2410259563d370a3b7bec45d"/>
     <w:p>
       <w:pPr>
         <w:pStyle w:val="Heading3"/>
@@ -3778,8 +3778,8 @@
         <w:t xml:space="preserve">. Guard hỏi là hành vi đúng thiết kế; model bị cấm viết lại lệnh để lách.</w:t>
       </w:r>
     </w:p>
-    <w:bookmarkEnd w:id="25"/>
-    <w:bookmarkStart w:id="26" w:name="X3b0de0c8018bf94e9b37701ca308a2d9441568f"/>
+    <w:bookmarkEnd w:id="35"/>
+    <w:bookmarkStart w:id="36" w:name="X3b0de0c8018bf94e9b37701ca308a2d9441568f"/>
     <w:p>
       <w:pPr>
         <w:pStyle w:val="Heading3"/>
@@ -3831,8 +3831,8 @@
         <w:t xml:space="preserve">), bỏ qua dạng phủ định ("chưa/không hoàn thành") và bỏ qua khi message đã tự khai "Chưa kiểm chứng" (vá false positive ~6% quan sát được khi đo). Đây là lớp cưỡng chế cho rule 30 — rule nghiêm nhất của harness.</w:t>
       </w:r>
     </w:p>
-    <w:bookmarkEnd w:id="26"/>
-    <w:bookmarkStart w:id="27" w:name="X59af8a056e2019fd7edcbc573002e28d3c431e9"/>
+    <w:bookmarkEnd w:id="36"/>
+    <w:bookmarkStart w:id="37" w:name="X59af8a056e2019fd7edcbc573002e28d3c431e9"/>
     <w:p>
       <w:pPr>
         <w:pStyle w:val="Heading3"/>
@@ -3874,9 +3874,9 @@
         <w:t xml:space="preserve">(giữ 5 bản gần nhất) trước khi Claude Code compact — rule 60/75 yêu cầu model đọc lại checkpoint sau compaction thay vì tái dựng từ trí nhớ.</w:t>
       </w:r>
     </w:p>
-    <w:bookmarkEnd w:id="27"/>
-    <w:bookmarkEnd w:id="28"/>
-    <w:bookmarkStart w:id="29" w:name="X2c361fc6f0b8646396425c50f94bdec657c25bb"/>
+    <w:bookmarkEnd w:id="37"/>
+    <w:bookmarkEnd w:id="38"/>
+    <w:bookmarkStart w:id="39" w:name="X2c361fc6f0b8646396425c50f94bdec657c25bb"/>
     <w:p>
       <w:pPr>
         <w:pStyle w:val="Heading2"/>
@@ -3893,8 +3893,8 @@
         <w:t xml:space="preserve">6 bước: fabrication scan (mọi số/tên/citation truy về 1 trong 4 nguồn: dữ liệu user / phép tính hiển thị / nguồn đã đọc / lệnh đã chạy) → verification status (hạ cấp claim chưa xứng) → cross-foot numbers (tính thật, không nhìn lướt) → sycophancy scan (sinh phản biện mạnh nhất) → scope scan (thừa gì/thiếu gì) → format compliance. Đầu ra: bảng 6 dòng PASS/FAIL. Nguyên tắc: FAIL khai báo trung thực là output chấp nhận được; FAIL giấu sau summary tự tin thì không.</w:t>
       </w:r>
     </w:p>
-    <w:bookmarkEnd w:id="29"/>
-    <w:bookmarkStart w:id="30" w:name="Xbf244a5b4057c7b3b6a7a34961c0624bb3994ca"/>
+    <w:bookmarkEnd w:id="39"/>
+    <w:bookmarkStart w:id="40" w:name="Xbf244a5b4057c7b3b6a7a34961c0624bb3994ca"/>
     <w:p>
       <w:pPr>
         <w:pStyle w:val="Heading2"/>
@@ -3911,8 +3911,8 @@
         <w:t xml:space="preserve">Bắt buộc trước deliverable lớn (&gt;5 trang, cost model, slide deck — rule 20.5). Hỏi 6 nhóm trong 1 message: người nhận &amp; bối cảnh · mục tiêu · phạm vi &amp; độ dài · định dạng &amp; chuẩn · nguồn dữ liệu · ràng buộc. Chốt spec ≤10 dòng chờ "chốt" rồi mới sản xuất. User bỏ qua ("cứ làm luôn") → khối "Giả định:" đầu deliverable.</w:t>
       </w:r>
     </w:p>
-    <w:bookmarkEnd w:id="30"/>
-    <w:bookmarkStart w:id="31" w:name="Xcab23b293b8ca9db09b16b1a93db515d40d5131"/>
+    <w:bookmarkEnd w:id="40"/>
+    <w:bookmarkStart w:id="41" w:name="Xcab23b293b8ca9db09b16b1a93db515d40d5131"/>
     <w:p>
       <w:pPr>
         <w:pStyle w:val="Heading2"/>
@@ -4013,8 +4013,8 @@
         <w:t xml:space="preserve">— worker Opus với system prompt nhúng kỷ luật Fable, báo cáo tiếng Việt.</w:t>
       </w:r>
     </w:p>
-    <w:bookmarkEnd w:id="31"/>
-    <w:bookmarkStart w:id="32" w:name="Xde32ea4b7b310f5019fa4c1005e18f467b33193"/>
+    <w:bookmarkEnd w:id="41"/>
+    <w:bookmarkStart w:id="42" w:name="Xde32ea4b7b310f5019fa4c1005e18f467b33193"/>
     <w:p>
       <w:pPr>
         <w:pStyle w:val="Heading2"/>
@@ -4248,8 +4248,8 @@
         <w:t xml:space="preserve">Rule project muốn ngoại lệ phải ghi rõ kèm lý do. Nguyên tắc đã kiểm chứng: CLAUDE.md &lt; 150 dòng; rule cần thực thi 100% → dùng hook; rules/CLAUDE.md sống qua compaction, quy ước nói trong chat thì mất.</w:t>
       </w:r>
     </w:p>
-    <w:bookmarkEnd w:id="32"/>
-    <w:bookmarkStart w:id="33" w:name="Xe3fd260f182627643cece5eb1a8ef2dcc7e5a0f"/>
+    <w:bookmarkEnd w:id="42"/>
+    <w:bookmarkStart w:id="43" w:name="Xe3fd260f182627643cece5eb1a8ef2dcc7e5a0f"/>
     <w:p>
       <w:pPr>
         <w:pStyle w:val="Heading2"/>
@@ -4438,8 +4438,8 @@
         <w:t xml:space="preserve">Vòng lặp tinh chỉnh: prompt trượt lặp lại → thêm ví dụ hành vi sai cụ thể + tăng mức mệnh lệnh vào rule → đo lại. Rules là code.</w:t>
       </w:r>
     </w:p>
-    <w:bookmarkEnd w:id="33"/>
-    <w:bookmarkStart w:id="34" w:name="X13b8f6729b8e969adab92fa0c5288e030824c1f"/>
+    <w:bookmarkEnd w:id="43"/>
+    <w:bookmarkStart w:id="44" w:name="X13b8f6729b8e969adab92fa0c5288e030824c1f"/>
     <w:p>
       <w:pPr>
         <w:pStyle w:val="Heading2"/>
@@ -4777,8 +4777,8 @@
         </w:tc>
       </w:tr>
     </w:tbl>
-    <w:bookmarkEnd w:id="34"/>
-    <w:bookmarkStart w:id="35" w:name="Xecac98c02093b36277e30cd83413a710b9e1f7d"/>
+    <w:bookmarkEnd w:id="44"/>
+    <w:bookmarkStart w:id="45" w:name="Xecac98c02093b36277e30cd83413a710b9e1f7d"/>
     <w:p>
       <w:pPr>
         <w:pStyle w:val="Heading2"/>
@@ -5198,8 +5198,8 @@
         </w:tc>
       </w:tr>
     </w:tbl>
-    <w:bookmarkEnd w:id="35"/>
-    <w:bookmarkStart w:id="36" w:name="X6840b94c6860f7741c00151496fe93231c2e84d"/>
+    <w:bookmarkEnd w:id="45"/>
+    <w:bookmarkStart w:id="46" w:name="X6840b94c6860f7741c00151496fe93231c2e84d"/>
     <w:p>
       <w:pPr>
         <w:pStyle w:val="Heading2"/>
@@ -5715,8 +5715,8 @@
         </w:tc>
       </w:tr>
     </w:tbl>
-    <w:bookmarkEnd w:id="36"/>
-    <w:bookmarkStart w:id="37" w:name="X911205eea64dd21c7cc6fa10621b40b6bada2bf"/>
+    <w:bookmarkEnd w:id="46"/>
+    <w:bookmarkStart w:id="47" w:name="X911205eea64dd21c7cc6fa10621b40b6bada2bf"/>
     <w:p>
       <w:pPr>
         <w:pStyle w:val="Heading2"/>
@@ -5795,8 +5795,8 @@
         <w:t xml:space="preserve">Chi phí thường trực ~2.800–3.200 token/phiên (10 rules + anchor) — đổi lấy hành vi ổn định đã đo được.</w:t>
       </w:r>
     </w:p>
-    <w:bookmarkEnd w:id="37"/>
-    <w:bookmarkStart w:id="38" w:name="phụ-lục-a--checklist-cài-đặt"/>
+    <w:bookmarkEnd w:id="47"/>
+    <w:bookmarkStart w:id="48" w:name="phụ-lục-a--checklist-cài-đặt"/>
     <w:p>
       <w:pPr>
         <w:pStyle w:val="Heading2"/>
@@ -6260,8 +6260,8 @@
         </w:tc>
       </w:tr>
     </w:tbl>
-    <w:bookmarkEnd w:id="38"/>
-    <w:bookmarkStart w:id="39" w:name="phụ-lục-b--cây-thư-mục-sau-khi-cài"/>
+    <w:bookmarkEnd w:id="48"/>
+    <w:bookmarkStart w:id="49" w:name="phụ-lục-b--cây-thư-mục-sau-khi-cài"/>
     <w:p>
       <w:pPr>
         <w:pStyle w:val="Heading2"/>
@@ -6416,8 +6416,8 @@
         <w:t xml:space="preserve">└── checkpoints/                        # sinh tự động khi compact (5 bản gần nhất)</w:t>
       </w:r>
     </w:p>
-    <w:bookmarkEnd w:id="39"/>
-    <w:bookmarkStart w:id="40" w:name="phụ-lục-c--nguồn-tham-khảo-trong-repo"/>
+    <w:bookmarkEnd w:id="49"/>
+    <w:bookmarkStart w:id="50" w:name="phụ-lục-c--nguồn-tham-khảo-trong-repo"/>
     <w:p>
       <w:pPr>
         <w:pStyle w:val="Heading2"/>
@@ -6703,9 +6703,11 @@
         <w:t xml:space="preserve">— Hết tài liệu —</w:t>
       </w:r>
     </w:p>
-    <w:bookmarkEnd w:id="40"/>
-    <w:bookmarkEnd w:id="41"/>
+    <w:bookmarkEnd w:id="50"/>
+    <w:bookmarkEnd w:id="51"/>
     <w:sectPr>
+      <w:headerReference r:id="rId9" w:type="default"/>
+      <w:footerReference r:id="rId10" w:type="default"/>
       <w:footnotePr>
         <w:numRestart w:val="eachSect"/>
       </w:footnotePr>
@@ -6718,6 +6720,36 @@
 <w:comments xmlns:w="http://schemas.openxmlformats.org/wordprocessingml/2006/main" xmlns:m="http://schemas.openxmlformats.org/officeDocument/2006/math" xmlns:r="http://schemas.openxmlformats.org/officeDocument/2006/relationships" xmlns:o="urn:schemas-microsoft-com:office:office" xmlns:v="urn:schemas-microsoft-com:vml" xmlns:w10="urn:schemas-microsoft-com:office:word" xmlns:a="http://schemas.openxmlformats.org/drawingml/2006/main" xmlns:pic="http://schemas.openxmlformats.org/drawingml/2006/picture" xmlns:wp="http://schemas.openxmlformats.org/drawingml/2006/wordprocessingDrawing"/>
 </file>
 
+<file path=word/footer1.xml><?xml version="1.0" encoding="utf-8"?>
+<w:ftr xmlns:m="http://schemas.openxmlformats.org/officeDocument/2006/math" xmlns:mc="http://schemas.openxmlformats.org/markup-compatibility/2006" xmlns:mo="http://schemas.microsoft.com/office/mac/office/2008/main" xmlns:mv="urn:schemas-microsoft-com:mac:vml" xmlns:o="urn:schemas-microsoft-com:office:office" xmlns:r="http://schemas.openxmlformats.org/officeDocument/2006/relationships" xmlns:v="urn:schemas-microsoft-com:vml" xmlns:w10="urn:schemas-microsoft-com:office:word" xmlns:w14="http://schemas.microsoft.com/office/word/2010/wordml" xmlns:w="http://schemas.openxmlformats.org/wordprocessingml/2006/main" xmlns:wne="http://schemas.microsoft.com/office/word/2006/wordml" xmlns:wp14="http://schemas.microsoft.com/office/word/2010/wordprocessingDrawing" xmlns:wp="http://schemas.openxmlformats.org/drawingml/2006/wordprocessingDrawing" xmlns:wpc="http://schemas.microsoft.com/office/word/2010/wordprocessingCanvas" xmlns:wpg="http://schemas.microsoft.com/office/word/2010/wordprocessingGroup" xmlns:wpi="http://schemas.microsoft.com/office/word/2010/wordprocessingInk" xmlns:wps="http://schemas.microsoft.com/office/word/2010/wordprocessingShape" mc:Ignorable="w14 wp14">
+  <w:p>
+    <w:pPr>
+      <w:pStyle w:val="Footer"/>
+    </w:pPr>
+    <w:r/>
+    <w:r>
+      <w:rPr>
+        <w:color w:val="6E6F6E"/>
+        <w:sz w:val="16"/>
+      </w:rPr>
+      <w:t>Fable Harness — Setup Guide</w:t>
+      <w:tab/>
+      <w:tab/>
+      <w:t xml:space="preserve">Trang </w:t>
+    </w:r>
+    <w:r>
+      <w:rPr>
+        <w:color w:val="6E6F6E"/>
+        <w:sz w:val="16"/>
+      </w:rPr>
+      <w:fldChar w:fldCharType="begin"/>
+      <w:instrText xml:space="preserve"> PAGE </w:instrText>
+      <w:fldChar w:fldCharType="end"/>
+    </w:r>
+  </w:p>
+</w:ftr>
+</file>
+
 <file path=word/footnotes.xml><?xml version="1.0" encoding="utf-8"?>
 <w:footnotes xmlns:w="http://schemas.openxmlformats.org/wordprocessingml/2006/main" xmlns:m="http://schemas.openxmlformats.org/officeDocument/2006/math" xmlns:r="http://schemas.openxmlformats.org/officeDocument/2006/relationships" xmlns:o="urn:schemas-microsoft-com:office:office" xmlns:v="urn:schemas-microsoft-com:vml" xmlns:w10="urn:schemas-microsoft-com:office:word" xmlns:a="http://schemas.openxmlformats.org/drawingml/2006/main" xmlns:pic="http://schemas.openxmlformats.org/drawingml/2006/picture" xmlns:wp="http://schemas.openxmlformats.org/drawingml/2006/wordprocessingDrawing">
   <w:footnote w:type="continuationSeparator" w:id="0">
@@ -6735,6 +6767,58 @@
     </w:p>
   </w:footnote>
 </w:footnotes>
+</file>
+
+<file path=word/header1.xml><?xml version="1.0" encoding="utf-8"?>
+<w:hdr xmlns:m="http://schemas.openxmlformats.org/officeDocument/2006/math" xmlns:mc="http://schemas.openxmlformats.org/markup-compatibility/2006" xmlns:mo="http://schemas.microsoft.com/office/mac/office/2008/main" xmlns:mv="urn:schemas-microsoft-com:mac:vml" xmlns:o="urn:schemas-microsoft-com:office:office" xmlns:r="http://schemas.openxmlformats.org/officeDocument/2006/relationships" xmlns:v="urn:schemas-microsoft-com:vml" xmlns:w10="urn:schemas-microsoft-com:office:word" xmlns:w14="http://schemas.microsoft.com/office/word/2010/wordml" xmlns:w="http://schemas.openxmlformats.org/wordprocessingml/2006/main" xmlns:wne="http://schemas.microsoft.com/office/word/2006/wordml" xmlns:wp14="http://schemas.microsoft.com/office/word/2010/wordprocessingDrawing" xmlns:wp="http://schemas.openxmlformats.org/drawingml/2006/wordprocessingDrawing" xmlns:wpc="http://schemas.microsoft.com/office/word/2010/wordprocessingCanvas" xmlns:wpg="http://schemas.microsoft.com/office/word/2010/wordprocessingGroup" xmlns:wpi="http://schemas.microsoft.com/office/word/2010/wordprocessingInk" xmlns:wps="http://schemas.microsoft.com/office/word/2010/wordprocessingShape" mc:Ignorable="w14 wp14">
+  <w:p>
+    <w:pPr>
+      <w:pStyle w:val="Header"/>
+    </w:pPr>
+    <w:r/>
+    <w:r>
+      <w:drawing>
+        <wp:inline xmlns:a="http://schemas.openxmlformats.org/drawingml/2006/main" xmlns:pic="http://schemas.openxmlformats.org/drawingml/2006/picture">
+          <wp:extent cx="708138" cy="306000"/>
+          <wp:docPr id="1" name="Picture 1"/>
+          <wp:cNvGraphicFramePr>
+            <a:graphicFrameLocks noChangeAspect="1"/>
+          </wp:cNvGraphicFramePr>
+          <a:graphic>
+            <a:graphicData uri="http://schemas.openxmlformats.org/drawingml/2006/picture">
+              <pic:pic>
+                <pic:nvPicPr>
+                  <pic:cNvPr id="0" name="foxai-logo.png"/>
+                  <pic:cNvPicPr/>
+                </pic:nvPicPr>
+                <pic:blipFill>
+                  <a:blip r:embed="rId1"/>
+                  <a:stretch>
+                    <a:fillRect/>
+                  </a:stretch>
+                </pic:blipFill>
+                <pic:spPr>
+                  <a:xfrm>
+                    <a:off x="0" y="0"/>
+                    <a:ext cx="708138" cy="306000"/>
+                  </a:xfrm>
+                  <a:prstGeom prst="rect"/>
+                </pic:spPr>
+              </pic:pic>
+            </a:graphicData>
+          </a:graphic>
+        </wp:inline>
+      </w:drawing>
+    </w:r>
+    <w:r>
+      <w:rPr>
+        <w:color w:val="6E6F6E"/>
+        <w:sz w:val="16"/>
+      </w:rPr>
+      <w:t xml:space="preserve">    Công ty CP Công nghệ FOXAI · fox.ai.vn — Tài liệu nội bộ</w:t>
+    </w:r>
+  </w:p>
+</w:hdr>
 </file>
 
 <file path=word/numbering.xml><?xml version="1.0" encoding="utf-8"?>
@@ -7132,7 +7216,9 @@
     </w:pPr>
     <w:rPr>
       <w:rFonts w:asciiTheme="majorHAnsi" w:cstheme="majorBidi" w:eastAsiaTheme="majorEastAsia" w:hAnsiTheme="majorHAnsi"/>
-      <w:sz w:val="56"/>
+      <w:b/>
+      <w:color w:val="0C5488"/>
+      <w:sz w:val="52"/>
       <w:szCs w:val="56"/>
     </w:rPr>
   </w:style>
@@ -7163,8 +7249,10 @@
     </w:pPr>
     <w:rPr>
       <w:rFonts w:cstheme="majorBidi" w:eastAsiaTheme="majorEastAsia"/>
+      <w:i/>
+      <w:color w:val="6E6F6E"/>
       <w:spacing w:val="15"/>
-      <w:sz w:val="28"/>
+      <w:sz w:val="26"/>
       <w:szCs w:val="28"/>
     </w:rPr>
   </w:style>
@@ -7266,8 +7354,9 @@
     </w:pPr>
     <w:rPr>
       <w:rFonts w:asciiTheme="majorHAnsi" w:cstheme="majorBidi" w:eastAsiaTheme="majorEastAsia" w:hAnsiTheme="majorHAnsi"/>
-      <w:color w:themeColor="accent1" w:themeShade="BF" w:val="0F4761"/>
-      <w:sz w:val="40"/>
+      <w:b/>
+      <w:color w:val="0C5488"/>
+      <w:sz w:val="32"/>
       <w:szCs w:val="40"/>
     </w:rPr>
   </w:style>
@@ -7289,8 +7378,9 @@
     </w:pPr>
     <w:rPr>
       <w:rFonts w:asciiTheme="majorHAnsi" w:cstheme="majorBidi" w:eastAsiaTheme="majorEastAsia" w:hAnsiTheme="majorHAnsi"/>
-      <w:color w:themeColor="accent1" w:themeShade="BF" w:val="0F4761"/>
-      <w:sz w:val="32"/>
+      <w:b/>
+      <w:color w:val="0C5488"/>
+      <w:sz w:val="26"/>
       <w:szCs w:val="32"/>
     </w:rPr>
   </w:style>
@@ -7312,8 +7402,9 @@
     </w:pPr>
     <w:rPr>
       <w:rFonts w:cstheme="majorBidi" w:eastAsiaTheme="majorEastAsia"/>
-      <w:color w:themeColor="accent1" w:themeShade="BF" w:val="0F4761"/>
-      <w:sz w:val="28"/>
+      <w:b/>
+      <w:color w:val="2A6DA0"/>
+      <w:sz w:val="23"/>
       <w:szCs w:val="28"/>
     </w:rPr>
   </w:style>
@@ -7335,9 +7426,11 @@
     </w:pPr>
     <w:rPr>
       <w:rFonts w:cstheme="majorBidi" w:eastAsiaTheme="majorEastAsia"/>
-      <w:i/>
+      <w:b/>
+      <w:i w:val="0"/>
       <w:iCs/>
-      <w:color w:themeColor="accent1" w:themeShade="BF" w:val="0F4761"/>
+      <w:color w:val="2A6DA0"/>
+      <w:sz w:val="22"/>
     </w:rPr>
   </w:style>
   <w:style w:styleId="Heading5" w:type="paragraph">
@@ -7579,6 +7672,9 @@
       <w:spacing w:after="100" w:before="100"/>
       <w:ind w:firstLine="0" w:left="480" w:right="480"/>
     </w:pPr>
+    <w:rPr>
+      <w:color w:val="6E6F6E"/>
+    </w:rPr>
   </w:style>
   <w:style w:styleId="FootnoteText" w:type="paragraph">
     <w:name w:val="Footnote Text"/>
@@ -7714,7 +7810,7 @@
     <w:name w:val="Hyperlink"/>
     <w:basedOn w:val="BodyTextChar"/>
     <w:rPr>
-      <w:color w:themeColor="accent1" w:val="4F81BD"/>
+      <w:color w:val="2A6DA0"/>
     </w:rPr>
   </w:style>
   <w:style w:styleId="TOCHeading" w:type="paragraph">

</xml_diff>